<commit_message>
Uskladi ogledni cas s udzbenikom, tabelom i cijelim kvizom
</commit_message>
<xml_diff>
--- a/materijali/Listici za ucenike.docx
+++ b/materijali/Listici za ucenike.docx
@@ -7,285 +7,156 @@
         <w:pStyle w:val="Title"/>
       </w:pPr>
       <w:r>
-        <w:t>Materijali za učenike</w:t>
+        <w:t>Pojmovi i primjeri iz lekcije</w:t>
       </w:r>
     </w:p>
     <w:p>
       <w:r>
-        <w:t>Vrednovanje djela u Zakonu Božijem · VIII razred</w:t>
+        <w:t>VIII razred • udžbenik str. 29–32</w:t>
+      </w:r>
+    </w:p>
+    <w:p>
+      <w:pPr>
+        <w:pStyle w:val="Heading2"/>
+      </w:pPr>
+      <w:r>
+        <w:t>Farz (str. 29)</w:t>
       </w:r>
     </w:p>
     <w:p>
       <w:r>
-        <w:t>Sažetak za učenje i rad u grupi. Pročitaj značenje, pronađi primjer i objasni izbor svojim riječima.</w:t>
+        <w:t>Stroga vjerska dužnost, naredba Uzvišenog Stvoritelja kojom se imperativno zahtijeva od punoljetne osobe činjenje određenog djela. Za izvršavanje slijedi nagrada, a za izostavljanje kazna.</w:t>
       </w:r>
     </w:p>
-    <w:tbl>
-      <w:tblPr>
-        <w:tblStyle w:val="TableGrid"/>
-        <w:tblW w:type="auto" w:w="0"/>
-        <w:tblLook w:firstColumn="1" w:firstRow="1" w:lastColumn="0" w:lastRow="0" w:noHBand="0" w:noVBand="1" w:val="04A0"/>
-      </w:tblPr>
-      <w:tblGrid>
-        <w:gridCol w:w="4986"/>
-        <w:gridCol w:w="4986"/>
-      </w:tblGrid>
-      <w:tr>
-        <w:tc>
-          <w:tcPr>
-            <w:tcW w:type="dxa" w:w="4986"/>
-          </w:tcPr>
-          <w:p>
-            <w:r>
-              <w:rPr>
-                <w:sz w:val="20"/>
-              </w:rPr>
-              <w:t>Pojam</w:t>
-            </w:r>
-          </w:p>
-        </w:tc>
-        <w:tc>
-          <w:tcPr>
-            <w:tcW w:type="dxa" w:w="4986"/>
-          </w:tcPr>
-          <w:p>
-            <w:r>
-              <w:rPr>
-                <w:sz w:val="20"/>
-              </w:rPr>
-              <w:t>Značenje i primjer</w:t>
-            </w:r>
-          </w:p>
-        </w:tc>
-      </w:tr>
-      <w:tr>
-        <w:tc>
-          <w:tcPr>
-            <w:tcW w:type="dxa" w:w="4986"/>
-          </w:tcPr>
-          <w:p>
-            <w:r>
-              <w:rPr>
-                <w:sz w:val="20"/>
-              </w:rPr>
-              <w:t>Farz</w:t>
-            </w:r>
-          </w:p>
-        </w:tc>
-        <w:tc>
-          <w:tcPr>
-            <w:tcW w:type="dxa" w:w="4986"/>
-          </w:tcPr>
-          <w:p>
-            <w:r>
-              <w:rPr>
-                <w:sz w:val="20"/>
-              </w:rPr>
-              <w:t>Stroga vjerska dužnost. Pet dnevnih namaza; ramazanski post za osobu koja je obavezna postiti.</w:t>
-            </w:r>
-          </w:p>
-        </w:tc>
-      </w:tr>
-      <w:tr>
-        <w:tc>
-          <w:tcPr>
-            <w:tcW w:type="dxa" w:w="4986"/>
-          </w:tcPr>
-          <w:p>
-            <w:r>
-              <w:rPr>
-                <w:sz w:val="20"/>
-              </w:rPr>
-              <w:t>Vadžib</w:t>
-            </w:r>
-          </w:p>
-        </w:tc>
-        <w:tc>
-          <w:tcPr>
-            <w:tcW w:type="dxa" w:w="4986"/>
-          </w:tcPr>
-          <w:p>
-            <w:r>
-              <w:rPr>
-                <w:sz w:val="20"/>
-              </w:rPr>
-              <w:t>Obaveza koja se u hanefijskom učenju razlikuje od farza po snazi dokaza. Nije samo preporuka. Vitr-namaz; sadekatu-l-fitr.</w:t>
-            </w:r>
-          </w:p>
-        </w:tc>
-      </w:tr>
-      <w:tr>
-        <w:tc>
-          <w:tcPr>
-            <w:tcW w:type="dxa" w:w="4986"/>
-          </w:tcPr>
-          <w:p>
-            <w:r>
-              <w:rPr>
-                <w:sz w:val="20"/>
-              </w:rPr>
-              <w:t>Sunnet</w:t>
-            </w:r>
-          </w:p>
-        </w:tc>
-        <w:tc>
-          <w:tcPr>
-            <w:tcW w:type="dxa" w:w="4986"/>
-          </w:tcPr>
-          <w:p>
-            <w:r>
-              <w:rPr>
-                <w:sz w:val="20"/>
-              </w:rPr>
-              <w:t>Djela i praksa Muhammeda, a.s., koje slijedimo. U ovoj podjeli označava preporučenu praksu. Sunneti dnevnih namaza.</w:t>
-            </w:r>
-          </w:p>
-        </w:tc>
-      </w:tr>
-      <w:tr>
-        <w:tc>
-          <w:tcPr>
-            <w:tcW w:type="dxa" w:w="4986"/>
-          </w:tcPr>
-          <w:p>
-            <w:r>
-              <w:rPr>
-                <w:sz w:val="20"/>
-              </w:rPr>
-              <w:t>Mustehab</w:t>
-            </w:r>
-          </w:p>
-        </w:tc>
-        <w:tc>
-          <w:tcPr>
-            <w:tcW w:type="dxa" w:w="4986"/>
-          </w:tcPr>
-          <w:p>
-            <w:r>
-              <w:rPr>
-                <w:sz w:val="20"/>
-              </w:rPr>
-              <w:t>Lijepo i preporučeno djelo; za činjenje slijedi nagrada, a izostavljanje se ne kažnjava. Dobrovoljno lijepo djelo; udžbenik navodi klanjanje u džematu.</w:t>
-            </w:r>
-          </w:p>
-        </w:tc>
-      </w:tr>
-      <w:tr>
-        <w:tc>
-          <w:tcPr>
-            <w:tcW w:type="dxa" w:w="4986"/>
-          </w:tcPr>
-          <w:p>
-            <w:r>
-              <w:rPr>
-                <w:sz w:val="20"/>
-              </w:rPr>
-              <w:t>Mubah</w:t>
-            </w:r>
-          </w:p>
-        </w:tc>
-        <w:tc>
-          <w:tcPr>
-            <w:tcW w:type="dxa" w:w="4986"/>
-          </w:tcPr>
-          <w:p>
-            <w:r>
-              <w:rPr>
-                <w:sz w:val="20"/>
-              </w:rPr>
-              <w:t>Dozvoljen izbor; sam po sebi nije ni obavezan ni zabranjen. Šetnja u slobodno vrijeme koja ne ometa obaveze.</w:t>
-            </w:r>
-          </w:p>
-        </w:tc>
-      </w:tr>
-      <w:tr>
-        <w:tc>
-          <w:tcPr>
-            <w:tcW w:type="dxa" w:w="4986"/>
-          </w:tcPr>
-          <w:p>
-            <w:r>
-              <w:rPr>
-                <w:sz w:val="20"/>
-              </w:rPr>
-              <w:t>Haram</w:t>
-            </w:r>
-          </w:p>
-        </w:tc>
-        <w:tc>
-          <w:tcPr>
-            <w:tcW w:type="dxa" w:w="4986"/>
-          </w:tcPr>
-          <w:p>
-            <w:r>
-              <w:rPr>
-                <w:sz w:val="20"/>
-              </w:rPr>
-              <w:t>Strogo zabranjeno djelo. Krađa; kockanje; pijenje alkohola.</w:t>
-            </w:r>
-          </w:p>
-        </w:tc>
-      </w:tr>
-      <w:tr>
-        <w:tc>
-          <w:tcPr>
-            <w:tcW w:type="dxa" w:w="4986"/>
-          </w:tcPr>
-          <w:p>
-            <w:r>
-              <w:rPr>
-                <w:sz w:val="20"/>
-              </w:rPr>
-              <w:t>Mekruh</w:t>
-            </w:r>
-          </w:p>
-        </w:tc>
-        <w:tc>
-          <w:tcPr>
-            <w:tcW w:type="dxa" w:w="4986"/>
-          </w:tcPr>
-          <w:p>
-            <w:r>
-              <w:rPr>
-                <w:sz w:val="20"/>
-              </w:rPr>
-              <w:t>Pokuđeno djelo. Udžbenik razlikuje tahrimen i tenzihen. Razgovor bez potrebe dok se uči ezan, prema primjeru u lekciji.</w:t>
-            </w:r>
-          </w:p>
-        </w:tc>
-      </w:tr>
-      <w:tr>
-        <w:tc>
-          <w:tcPr>
-            <w:tcW w:type="dxa" w:w="4986"/>
-          </w:tcPr>
-          <w:p>
-            <w:r>
-              <w:rPr>
-                <w:sz w:val="20"/>
-              </w:rPr>
-              <w:t>Mufsid</w:t>
-            </w:r>
-          </w:p>
-        </w:tc>
-        <w:tc>
-          <w:tcPr>
-            <w:tcW w:type="dxa" w:w="4986"/>
-          </w:tcPr>
-          <w:p>
-            <w:r>
-              <w:rPr>
-                <w:sz w:val="20"/>
-              </w:rPr>
-              <w:t>Radnja ili stanje koje kvari određeni ibadet. Uvijek navedi koji. Namjeran obični razgovor u namazu kvari namaz, ali sam po sebi ne kvari abdest.</w:t>
-            </w:r>
-          </w:p>
-        </w:tc>
-      </w:tr>
-    </w:tbl>
     <w:p>
       <w:r>
-        <w:t>Važno: vadžib je obaveza; mubah je slobodan dozvoljen izbor. Mufsid povezujemo s određenim ibadetom. Govor u namazu kvari namaz, ali sam po sebi ne kvari abdest.</w:t>
+        <w:t>Namaz; pet islamskih dužnosti kao obaveze pojedinca; dženaza-namaz kao obaveza zajednice.</w:t>
+      </w:r>
+    </w:p>
+    <w:p>
+      <w:pPr>
+        <w:pStyle w:val="Heading2"/>
+      </w:pPr>
+      <w:r>
+        <w:t>Vadžib (str. 29)</w:t>
+      </w:r>
+    </w:p>
+    <w:p>
+      <w:r>
+        <w:t>Allahova, dž.š., naredba u blažoj formi od farza. Zahtjev za činjenjem djela propisanog pojedinačnim predajama od Poslanika, a.s.</w:t>
+      </w:r>
+    </w:p>
+    <w:p>
+      <w:r>
+        <w:t>Sadekatu-l-fitr i klanjanje vitr-namaza.</w:t>
+      </w:r>
+    </w:p>
+    <w:p>
+      <w:pPr>
+        <w:pStyle w:val="Heading2"/>
+      </w:pPr>
+      <w:r>
+        <w:t>Sunnet (str. 29)</w:t>
+      </w:r>
+    </w:p>
+    <w:p>
+      <w:r>
+        <w:t>Djela koja je radio Muhammed, a.s., i preporučio ih i nama. Njihovim izvršavanjem možemo zaslužiti nagradu i šefaat Muhammeda, a.s.</w:t>
+      </w:r>
+    </w:p>
+    <w:p>
+      <w:r>
+        <w:t>Sunneti i sunsunneti dnevnih namaza.</w:t>
+      </w:r>
+    </w:p>
+    <w:p>
+      <w:pPr>
+        <w:pStyle w:val="Heading2"/>
+      </w:pPr>
+      <w:r>
+        <w:t>Mustehab (str. 29–30)</w:t>
+      </w:r>
+    </w:p>
+    <w:p>
+      <w:r>
+        <w:t>Ono što je preporučeno i lijepo činiti. Izvršavanje se nagrađuje, a izostavljanje ne kažnjava.</w:t>
+      </w:r>
+    </w:p>
+    <w:p>
+      <w:r>
+        <w:t>Klanjanje u džematu — primjer naveden u udžbeniku.</w:t>
+      </w:r>
+    </w:p>
+    <w:p>
+      <w:pPr>
+        <w:pStyle w:val="Heading2"/>
+      </w:pPr>
+      <w:r>
+        <w:t>Mubah (str. 30)</w:t>
+      </w:r>
+    </w:p>
+    <w:p>
+      <w:r>
+        <w:t>Djelo čije se izvršavanje ili neizvršavanje ostavlja osobi na slobodan izbor. Za samo izvršenje ili neizvršenje osoba nema ni nagradu ni kaznu.</w:t>
+      </w:r>
+    </w:p>
+    <w:p>
+      <w:r>
+        <w:t>Izbor da jedemo, spavamo, šetamo i slično.</w:t>
+      </w:r>
+    </w:p>
+    <w:p>
+      <w:pPr>
+        <w:pStyle w:val="Heading2"/>
+      </w:pPr>
+      <w:r>
+        <w:t>Haram (str. 30)</w:t>
+      </w:r>
+    </w:p>
+    <w:p>
+      <w:r>
+        <w:t>Ono što Uzvišeni Allah strogo zabranjuje. Imperativna zabrana utemeljena na jasnom kur’anskom ajetu ili hadisu; zahtijeva nečinjenje djela.</w:t>
+      </w:r>
+    </w:p>
+    <w:p>
+      <w:r>
+        <w:t>Pijenje alkohola, kockanje, krađa i zinaluk.</w:t>
+      </w:r>
+    </w:p>
+    <w:p>
+      <w:pPr>
+        <w:pStyle w:val="Heading2"/>
+      </w:pPr>
+      <w:r>
+        <w:t>Mekruh (str. 30)</w:t>
+      </w:r>
+    </w:p>
+    <w:p>
+      <w:r>
+        <w:t>Djelo koje je pokuđeno, ružno činiti. Mekruh-i tahrimen su djela bliska haramu, a mekruh-i tenzihen djela koja nije lijepo činiti.</w:t>
+      </w:r>
+    </w:p>
+    <w:p>
+      <w:r>
+        <w:t>Tahrimen: rasipništvo i prenošenje tuđih riječi. Tenzihen: pričati u vrijeme učenja Kur’ana ili ezana.</w:t>
+      </w:r>
+    </w:p>
+    <w:p>
+      <w:pPr>
+        <w:pStyle w:val="Heading2"/>
+      </w:pPr>
+      <w:r>
+        <w:t>Mufsid (str. 30)</w:t>
+      </w:r>
+    </w:p>
+    <w:p>
+      <w:r>
+        <w:t>Djelo, radnja ili stanje koje kvari vjerski obred.</w:t>
+      </w:r>
+    </w:p>
+    <w:p>
+      <w:r>
+        <w:t>Udžbenik navodi govor u namazu, san i uzimanje hrane ili pića u vrijeme posta. Preciziranje: obični govor kvari namaz, ali sam po sebi ne abdest; kod sna i jela/pića važni su uslovi.</w:t>
       </w:r>
     </w:p>
     <w:p>
@@ -295,288 +166,15 @@
     </w:p>
     <w:p>
       <w:pPr>
-        <w:pStyle w:val="Heading1"/>
+        <w:pStyle w:val="Title"/>
       </w:pPr>
       <w:r>
-        <w:t>Kartice za razvrstavanje</w:t>
+        <w:t>Termini sa 32. strane</w:t>
       </w:r>
     </w:p>
     <w:p>
       <w:r>
-        <w:t>Jedan komplet po grupi. Izrežite kartice po rubovima. Zatim ih postavite uz odgovarajuće pojmove na radnoj podlozi.</w:t>
-      </w:r>
-    </w:p>
-    <w:tbl>
-      <w:tblPr>
-        <w:tblStyle w:val="TableGrid"/>
-        <w:tblW w:type="auto" w:w="0"/>
-        <w:tblLook w:firstColumn="1" w:firstRow="1" w:lastColumn="0" w:lastRow="0" w:noHBand="0" w:noVBand="1" w:val="04A0"/>
-      </w:tblPr>
-      <w:tblGrid>
-        <w:gridCol w:w="4986"/>
-        <w:gridCol w:w="4986"/>
-      </w:tblGrid>
-      <w:tr>
-        <w:tc>
-          <w:tcPr>
-            <w:tcW w:type="dxa" w:w="4986"/>
-          </w:tcPr>
-          <w:p>
-            <w:r>
-              <w:rPr>
-                <w:sz w:val="20"/>
-              </w:rPr>
-              <w:t>Broj</w:t>
-            </w:r>
-          </w:p>
-        </w:tc>
-        <w:tc>
-          <w:tcPr>
-            <w:tcW w:type="dxa" w:w="4986"/>
-          </w:tcPr>
-          <w:p>
-            <w:r>
-              <w:rPr>
-                <w:sz w:val="20"/>
-              </w:rPr>
-              <w:t>Postupak ili opis</w:t>
-            </w:r>
-          </w:p>
-        </w:tc>
-      </w:tr>
-      <w:tr>
-        <w:tc>
-          <w:tcPr>
-            <w:tcW w:type="dxa" w:w="4986"/>
-          </w:tcPr>
-          <w:p>
-            <w:r>
-              <w:rPr>
-                <w:sz w:val="20"/>
-              </w:rPr>
-              <w:t>1</w:t>
-            </w:r>
-          </w:p>
-        </w:tc>
-        <w:tc>
-          <w:tcPr>
-            <w:tcW w:type="dxa" w:w="4986"/>
-          </w:tcPr>
-          <w:p>
-            <w:r>
-              <w:rPr>
-                <w:sz w:val="20"/>
-              </w:rPr>
-              <w:t>Ramazanski post osobe koja je obavezna postiti.</w:t>
-            </w:r>
-          </w:p>
-        </w:tc>
-      </w:tr>
-      <w:tr>
-        <w:tc>
-          <w:tcPr>
-            <w:tcW w:type="dxa" w:w="4986"/>
-          </w:tcPr>
-          <w:p>
-            <w:r>
-              <w:rPr>
-                <w:sz w:val="20"/>
-              </w:rPr>
-              <w:t>2</w:t>
-            </w:r>
-          </w:p>
-        </w:tc>
-        <w:tc>
-          <w:tcPr>
-            <w:tcW w:type="dxa" w:w="4986"/>
-          </w:tcPr>
-          <w:p>
-            <w:r>
-              <w:rPr>
-                <w:sz w:val="20"/>
-              </w:rPr>
-              <w:t>Klanjanje vitr-namaza.</w:t>
-            </w:r>
-          </w:p>
-        </w:tc>
-      </w:tr>
-      <w:tr>
-        <w:tc>
-          <w:tcPr>
-            <w:tcW w:type="dxa" w:w="4986"/>
-          </w:tcPr>
-          <w:p>
-            <w:r>
-              <w:rPr>
-                <w:sz w:val="20"/>
-              </w:rPr>
-              <w:t>3</w:t>
-            </w:r>
-          </w:p>
-        </w:tc>
-        <w:tc>
-          <w:tcPr>
-            <w:tcW w:type="dxa" w:w="4986"/>
-          </w:tcPr>
-          <w:p>
-            <w:r>
-              <w:rPr>
-                <w:sz w:val="20"/>
-              </w:rPr>
-              <w:t>Klanjanje sunneta dnevnog namaza.</w:t>
-            </w:r>
-          </w:p>
-        </w:tc>
-      </w:tr>
-      <w:tr>
-        <w:tc>
-          <w:tcPr>
-            <w:tcW w:type="dxa" w:w="4986"/>
-          </w:tcPr>
-          <w:p>
-            <w:r>
-              <w:rPr>
-                <w:sz w:val="20"/>
-              </w:rPr>
-              <w:t>4</w:t>
-            </w:r>
-          </w:p>
-        </w:tc>
-        <w:tc>
-          <w:tcPr>
-            <w:tcW w:type="dxa" w:w="4986"/>
-          </w:tcPr>
-          <w:p>
-            <w:r>
-              <w:rPr>
-                <w:sz w:val="20"/>
-              </w:rPr>
-              <w:t>Djelo koje je lijepo činiti, a njegovo izostavljanje se ne kažnjava.</w:t>
-            </w:r>
-          </w:p>
-        </w:tc>
-      </w:tr>
-      <w:tr>
-        <w:tc>
-          <w:tcPr>
-            <w:tcW w:type="dxa" w:w="4986"/>
-          </w:tcPr>
-          <w:p>
-            <w:r>
-              <w:rPr>
-                <w:sz w:val="20"/>
-              </w:rPr>
-              <w:t>5</w:t>
-            </w:r>
-          </w:p>
-        </w:tc>
-        <w:tc>
-          <w:tcPr>
-            <w:tcW w:type="dxa" w:w="4986"/>
-          </w:tcPr>
-          <w:p>
-            <w:r>
-              <w:rPr>
-                <w:sz w:val="20"/>
-              </w:rPr>
-              <w:t>Šetnja u slobodno vrijeme, nakon izvršenih obaveza.</w:t>
-            </w:r>
-          </w:p>
-        </w:tc>
-      </w:tr>
-      <w:tr>
-        <w:tc>
-          <w:tcPr>
-            <w:tcW w:type="dxa" w:w="4986"/>
-          </w:tcPr>
-          <w:p>
-            <w:r>
-              <w:rPr>
-                <w:sz w:val="20"/>
-              </w:rPr>
-              <w:t>6</w:t>
-            </w:r>
-          </w:p>
-        </w:tc>
-        <w:tc>
-          <w:tcPr>
-            <w:tcW w:type="dxa" w:w="4986"/>
-          </w:tcPr>
-          <w:p>
-            <w:r>
-              <w:rPr>
-                <w:sz w:val="20"/>
-              </w:rPr>
-              <w:t>Uzimanje tuđe stvari s namjerom da se ukrade.</w:t>
-            </w:r>
-          </w:p>
-        </w:tc>
-      </w:tr>
-      <w:tr>
-        <w:tc>
-          <w:tcPr>
-            <w:tcW w:type="dxa" w:w="4986"/>
-          </w:tcPr>
-          <w:p>
-            <w:r>
-              <w:rPr>
-                <w:sz w:val="20"/>
-              </w:rPr>
-              <w:t>7</w:t>
-            </w:r>
-          </w:p>
-        </w:tc>
-        <w:tc>
-          <w:tcPr>
-            <w:tcW w:type="dxa" w:w="4986"/>
-          </w:tcPr>
-          <w:p>
-            <w:r>
-              <w:rPr>
-                <w:sz w:val="20"/>
-              </w:rPr>
-              <w:t>Razgovor bez potrebe dok se uči ezan, prema primjeru iz lekcije.</w:t>
-            </w:r>
-          </w:p>
-        </w:tc>
-      </w:tr>
-      <w:tr>
-        <w:tc>
-          <w:tcPr>
-            <w:tcW w:type="dxa" w:w="4986"/>
-          </w:tcPr>
-          <w:p>
-            <w:r>
-              <w:rPr>
-                <w:sz w:val="20"/>
-              </w:rPr>
-              <w:t>8</w:t>
-            </w:r>
-          </w:p>
-        </w:tc>
-        <w:tc>
-          <w:tcPr>
-            <w:tcW w:type="dxa" w:w="4986"/>
-          </w:tcPr>
-          <w:p>
-            <w:r>
-              <w:rPr>
-                <w:sz w:val="20"/>
-              </w:rPr>
-              <w:t>Namjerno započinjanje običnog razgovora u namazu. Koji se ibadet kvari?</w:t>
-            </w:r>
-          </w:p>
-        </w:tc>
-      </w:tr>
-    </w:tbl>
-    <w:p>
-      <w:r>
-        <w:t>Uloge: čitač, zapisničar, provjeravač u udžbeniku, izvjestilac. Svaki član grupe objašnjava barem jednu karticu. Zajedno napišite dva razloga na sljedećem listu.</w:t>
-      </w:r>
-    </w:p>
-    <w:p>
-      <w:r>
-        <w:br w:type="page"/>
+        <w:t>Ime: ____________________    Rad u paru, zatim samostalno objašnjenje.</w:t>
       </w:r>
     </w:p>
     <w:p>
@@ -584,298 +182,90 @@
         <w:pStyle w:val="Heading1"/>
       </w:pPr>
       <w:r>
-        <w:t>Radna podloga</w:t>
+        <w:t>1. Poveži termin i značenje</w:t>
       </w:r>
     </w:p>
     <w:p>
       <w:r>
-        <w:t>Grupa ________  Članovi __________________________________</w:t>
-      </w:r>
-    </w:p>
-    <w:tbl>
-      <w:tblPr>
-        <w:tblStyle w:val="TableGrid"/>
-        <w:tblW w:type="auto" w:w="0"/>
-        <w:tblLook w:firstColumn="1" w:firstRow="1" w:lastColumn="0" w:lastRow="0" w:noHBand="0" w:noVBand="1" w:val="04A0"/>
-      </w:tblPr>
-      <w:tblGrid>
-        <w:gridCol w:w="4986"/>
-        <w:gridCol w:w="4986"/>
-      </w:tblGrid>
-      <w:tr>
-        <w:tc>
-          <w:tcPr>
-            <w:tcW w:type="dxa" w:w="4986"/>
-          </w:tcPr>
-          <w:p>
-            <w:r>
-              <w:rPr>
-                <w:sz w:val="20"/>
-              </w:rPr>
-              <w:t>Pojam</w:t>
-            </w:r>
-          </w:p>
-        </w:tc>
-        <w:tc>
-          <w:tcPr>
-            <w:tcW w:type="dxa" w:w="4986"/>
-          </w:tcPr>
-          <w:p>
-            <w:r>
-              <w:rPr>
-                <w:sz w:val="20"/>
-              </w:rPr>
-              <w:t>Broj kartice</w:t>
-            </w:r>
-          </w:p>
-        </w:tc>
-      </w:tr>
-      <w:tr>
-        <w:tc>
-          <w:tcPr>
-            <w:tcW w:type="dxa" w:w="4986"/>
-          </w:tcPr>
-          <w:p>
-            <w:r>
-              <w:rPr>
-                <w:sz w:val="20"/>
-              </w:rPr>
-              <w:t>Farz</w:t>
-            </w:r>
-          </w:p>
-        </w:tc>
-        <w:tc>
-          <w:tcPr>
-            <w:tcW w:type="dxa" w:w="4986"/>
-          </w:tcPr>
-          <w:p>
-            <w:r>
-              <w:rPr>
-                <w:sz w:val="20"/>
-              </w:rPr>
-              <w:t>_______________________</w:t>
-            </w:r>
-          </w:p>
-        </w:tc>
-      </w:tr>
-      <w:tr>
-        <w:tc>
-          <w:tcPr>
-            <w:tcW w:type="dxa" w:w="4986"/>
-          </w:tcPr>
-          <w:p>
-            <w:r>
-              <w:rPr>
-                <w:sz w:val="20"/>
-              </w:rPr>
-              <w:t>Vadžib</w:t>
-            </w:r>
-          </w:p>
-        </w:tc>
-        <w:tc>
-          <w:tcPr>
-            <w:tcW w:type="dxa" w:w="4986"/>
-          </w:tcPr>
-          <w:p>
-            <w:r>
-              <w:rPr>
-                <w:sz w:val="20"/>
-              </w:rPr>
-              <w:t>_______________________</w:t>
-            </w:r>
-          </w:p>
-        </w:tc>
-      </w:tr>
-      <w:tr>
-        <w:tc>
-          <w:tcPr>
-            <w:tcW w:type="dxa" w:w="4986"/>
-          </w:tcPr>
-          <w:p>
-            <w:r>
-              <w:rPr>
-                <w:sz w:val="20"/>
-              </w:rPr>
-              <w:t>Sunnet</w:t>
-            </w:r>
-          </w:p>
-        </w:tc>
-        <w:tc>
-          <w:tcPr>
-            <w:tcW w:type="dxa" w:w="4986"/>
-          </w:tcPr>
-          <w:p>
-            <w:r>
-              <w:rPr>
-                <w:sz w:val="20"/>
-              </w:rPr>
-              <w:t>_______________________</w:t>
-            </w:r>
-          </w:p>
-        </w:tc>
-      </w:tr>
-      <w:tr>
-        <w:tc>
-          <w:tcPr>
-            <w:tcW w:type="dxa" w:w="4986"/>
-          </w:tcPr>
-          <w:p>
-            <w:r>
-              <w:rPr>
-                <w:sz w:val="20"/>
-              </w:rPr>
-              <w:t>Mustehab</w:t>
-            </w:r>
-          </w:p>
-        </w:tc>
-        <w:tc>
-          <w:tcPr>
-            <w:tcW w:type="dxa" w:w="4986"/>
-          </w:tcPr>
-          <w:p>
-            <w:r>
-              <w:rPr>
-                <w:sz w:val="20"/>
-              </w:rPr>
-              <w:t>_______________________</w:t>
-            </w:r>
-          </w:p>
-        </w:tc>
-      </w:tr>
-      <w:tr>
-        <w:tc>
-          <w:tcPr>
-            <w:tcW w:type="dxa" w:w="4986"/>
-          </w:tcPr>
-          <w:p>
-            <w:r>
-              <w:rPr>
-                <w:sz w:val="20"/>
-              </w:rPr>
-              <w:t>Mubah</w:t>
-            </w:r>
-          </w:p>
-        </w:tc>
-        <w:tc>
-          <w:tcPr>
-            <w:tcW w:type="dxa" w:w="4986"/>
-          </w:tcPr>
-          <w:p>
-            <w:r>
-              <w:rPr>
-                <w:sz w:val="20"/>
-              </w:rPr>
-              <w:t>_______________________</w:t>
-            </w:r>
-          </w:p>
-        </w:tc>
-      </w:tr>
-      <w:tr>
-        <w:tc>
-          <w:tcPr>
-            <w:tcW w:type="dxa" w:w="4986"/>
-          </w:tcPr>
-          <w:p>
-            <w:r>
-              <w:rPr>
-                <w:sz w:val="20"/>
-              </w:rPr>
-              <w:t>Haram</w:t>
-            </w:r>
-          </w:p>
-        </w:tc>
-        <w:tc>
-          <w:tcPr>
-            <w:tcW w:type="dxa" w:w="4986"/>
-          </w:tcPr>
-          <w:p>
-            <w:r>
-              <w:rPr>
-                <w:sz w:val="20"/>
-              </w:rPr>
-              <w:t>_______________________</w:t>
-            </w:r>
-          </w:p>
-        </w:tc>
-      </w:tr>
-      <w:tr>
-        <w:tc>
-          <w:tcPr>
-            <w:tcW w:type="dxa" w:w="4986"/>
-          </w:tcPr>
-          <w:p>
-            <w:r>
-              <w:rPr>
-                <w:sz w:val="20"/>
-              </w:rPr>
-              <w:t>Mekruh</w:t>
-            </w:r>
-          </w:p>
-        </w:tc>
-        <w:tc>
-          <w:tcPr>
-            <w:tcW w:type="dxa" w:w="4986"/>
-          </w:tcPr>
-          <w:p>
-            <w:r>
-              <w:rPr>
-                <w:sz w:val="20"/>
-              </w:rPr>
-              <w:t>_______________________</w:t>
-            </w:r>
-          </w:p>
-        </w:tc>
-      </w:tr>
-      <w:tr>
-        <w:tc>
-          <w:tcPr>
-            <w:tcW w:type="dxa" w:w="4986"/>
-          </w:tcPr>
-          <w:p>
-            <w:r>
-              <w:rPr>
-                <w:sz w:val="20"/>
-              </w:rPr>
-              <w:t>Mufsid</w:t>
-            </w:r>
-          </w:p>
-        </w:tc>
-        <w:tc>
-          <w:tcPr>
-            <w:tcW w:type="dxa" w:w="4986"/>
-          </w:tcPr>
-          <w:p>
-            <w:r>
-              <w:rPr>
-                <w:sz w:val="20"/>
-              </w:rPr>
-              <w:t>_______________________</w:t>
-            </w:r>
-          </w:p>
-        </w:tc>
-      </w:tr>
-    </w:tbl>
-    <w:p>
-      <w:r>
-        <w:t>Naše prvo obrazloženje</w:t>
-        <w:br/>
-        <w:t>________________________________________________________</w:t>
-        <w:br/>
-        <w:t>________________________________________________________</w:t>
+        <w:t>1. Kategorično: ____</w:t>
       </w:r>
     </w:p>
     <w:p>
       <w:r>
-        <w:t>Naše drugo obrazloženje</w:t>
-        <w:br/>
-        <w:t>________________________________________________________</w:t>
-        <w:br/>
-        <w:t>________________________________________________________</w:t>
+        <w:t>2. Imperativ: ____</w:t>
       </w:r>
     </w:p>
     <w:p>
       <w:r>
-        <w:t>Šta smo provjerili u udžbeniku i na kojoj stranici?</w:t>
+        <w:t>3. Mutevatir hadis: ____</w:t>
+      </w:r>
+    </w:p>
+    <w:p>
+      <w:r>
+        <w:t>4. Zinaluk: ____</w:t>
+      </w:r>
+    </w:p>
+    <w:p>
+      <w:r>
+        <w:t>A. Hadis koji iz generacije u generaciju prenosi veliki broj prenosilaca tako da je isključena ikakva sumnja u njegovu vjerodostojnost.</w:t>
+      </w:r>
+    </w:p>
+    <w:p>
+      <w:r>
+        <w:t>B. Blud.</w:t>
+      </w:r>
+    </w:p>
+    <w:p>
+      <w:r>
+        <w:t>C. O čemu nema sumnje; sigurno, bezuvjetno, tačno određeno.</w:t>
+      </w:r>
+    </w:p>
+    <w:p>
+      <w:r>
+        <w:t>D. Zapovijed, naredba.</w:t>
+      </w:r>
+    </w:p>
+    <w:p>
+      <w:pPr>
+        <w:pStyle w:val="Heading1"/>
+      </w:pPr>
+      <w:r>
+        <w:t>2. Dopuni rečenice</w:t>
+      </w:r>
+    </w:p>
+    <w:p>
+      <w:r>
+        <w:t>Ono što je sigurno, bezuvjetno i tačno određeno jeste ____________.</w:t>
+      </w:r>
+    </w:p>
+    <w:p>
+      <w:r>
+        <w:t>Zapovijed ili naredba naziva se ____________.</w:t>
+      </w:r>
+    </w:p>
+    <w:p>
+      <w:r>
+        <w:t>Hadis koji kroz generacije prenosi veliki broj prenosilaca, bez sumnje u vjerodostojnost, naziva se ____________.</w:t>
+      </w:r>
+    </w:p>
+    <w:p>
+      <w:r>
+        <w:t>Udžbenički termin koji znači blud je ____________.</w:t>
+      </w:r>
+    </w:p>
+    <w:p>
+      <w:pPr>
+        <w:pStyle w:val="Heading1"/>
+      </w:pPr>
+      <w:r>
+        <w:t>3. Objasni svojim riječima</w:t>
+      </w:r>
+    </w:p>
+    <w:p>
+      <w:r>
+        <w:t>Izaberi jedan termin i poveži ga sa sadržajem lekcije.</w:t>
+        <w:br/>
+        <w:t>________________________________________________________</w:t>
         <w:br/>
         <w:t>________________________________________________________</w:t>
       </w:r>
@@ -887,246 +277,254 @@
     </w:p>
     <w:p>
       <w:pPr>
-        <w:pStyle w:val="Heading1"/>
+        <w:pStyle w:val="Title"/>
       </w:pPr>
       <w:r>
-        <w:t>Slučajevi za razgovor</w:t>
+        <w:t>Kviz | pitanja 1–6 od 12</w:t>
       </w:r>
     </w:p>
     <w:p>
       <w:r>
-        <w:t>Nastavnik dodjeljuje jedan slučaj svakoj grupi. Dogovorite zaključak i razlog. Razgovarajte o postupku u primjeru.</w:t>
+        <w:t>Ime: ____________________    Zaokruži jedan odgovor na svako pitanje.</w:t>
+      </w:r>
+    </w:p>
+    <w:p>
+      <w:r>
+        <w:rPr>
+          <w:b/>
+        </w:rPr>
+        <w:t>1. Kako se zove disciplina koja proučava propise o ljudskim djelima?</w:t>
       </w:r>
     </w:p>
     <w:p>
       <w:pPr>
-        <w:pStyle w:val="Heading2"/>
+        <w:spacing w:after="20"/>
       </w:pPr>
       <w:r>
-        <w:t>Slučaj A</w:t>
+        <w:t>A) Fikh</w:t>
+      </w:r>
+    </w:p>
+    <w:p>
+      <w:pPr>
+        <w:spacing w:after="20"/>
+      </w:pPr>
+      <w:r>
+        <w:t>B) Geografija</w:t>
+      </w:r>
+    </w:p>
+    <w:p>
+      <w:pPr>
+        <w:spacing w:after="20"/>
+      </w:pPr>
+      <w:r>
+        <w:t>C) Historija</w:t>
+      </w:r>
+    </w:p>
+    <w:p>
+      <w:pPr>
+        <w:spacing w:after="160"/>
+      </w:pPr>
+      <w:r>
+        <w:t>D) Kaligrafija</w:t>
       </w:r>
     </w:p>
     <w:p>
       <w:r>
-        <w:t>Nakon obaveza Lejla bira hoće li prošetati ili ostati kod kuće. Prijateljica tvrdi: „Ako nije farz, onda je haram.”</w:t>
+        <w:rPr>
+          <w:b/>
+        </w:rPr>
+        <w:t>2. Koji par ispravno povezuje djelo i kategoriju?</w:t>
+      </w:r>
+    </w:p>
+    <w:p>
+      <w:pPr>
+        <w:spacing w:after="20"/>
+      </w:pPr>
+      <w:r>
+        <w:t>A) Vitr-namaz — mubah</w:t>
+      </w:r>
+    </w:p>
+    <w:p>
+      <w:pPr>
+        <w:spacing w:after="20"/>
+      </w:pPr>
+      <w:r>
+        <w:t>B) Ramazanski post — farz</w:t>
+      </w:r>
+    </w:p>
+    <w:p>
+      <w:pPr>
+        <w:spacing w:after="20"/>
+      </w:pPr>
+      <w:r>
+        <w:t>C) Krađa — mekruh</w:t>
+      </w:r>
+    </w:p>
+    <w:p>
+      <w:pPr>
+        <w:spacing w:after="160"/>
+      </w:pPr>
+      <w:r>
+        <w:t>D) Šetnja — vadžib</w:t>
       </w:r>
     </w:p>
     <w:p>
       <w:r>
-        <w:t>Procijenite šetnju u navedenim okolnostima. Ispravite tvrdnju i navedite razlog.</w:t>
+        <w:rPr>
+          <w:b/>
+        </w:rPr>
+        <w:t>3. Kako se u lekciji razvrstava vitr-namaz?</w:t>
+      </w:r>
+    </w:p>
+    <w:p>
+      <w:pPr>
+        <w:spacing w:after="20"/>
+      </w:pPr>
+      <w:r>
+        <w:t>A) Sunnet</w:t>
+      </w:r>
+    </w:p>
+    <w:p>
+      <w:pPr>
+        <w:spacing w:after="20"/>
+      </w:pPr>
+      <w:r>
+        <w:t>B) Mubah</w:t>
+      </w:r>
+    </w:p>
+    <w:p>
+      <w:pPr>
+        <w:spacing w:after="20"/>
+      </w:pPr>
+      <w:r>
+        <w:t>C) Vadžib</w:t>
+      </w:r>
+    </w:p>
+    <w:p>
+      <w:pPr>
+        <w:spacing w:after="160"/>
+      </w:pPr>
+      <w:r>
+        <w:t>D) Mufsid</w:t>
       </w:r>
     </w:p>
     <w:p>
       <w:r>
-        <w:t>Zaključak i razlog: ______________________________________</w:t>
-        <w:br/>
-        <w:t>________________________________________________________</w:t>
+        <w:rPr>
+          <w:b/>
+        </w:rPr>
+        <w:t>4. Učenica je završila obaveze i bira hoće li prošetati. Šetnja je u ovom primjeru…</w:t>
       </w:r>
     </w:p>
     <w:p>
       <w:pPr>
-        <w:pStyle w:val="Heading2"/>
+        <w:spacing w:after="20"/>
       </w:pPr>
       <w:r>
-        <w:t>Slučaj B</w:t>
+        <w:t>A) Haram</w:t>
+      </w:r>
+    </w:p>
+    <w:p>
+      <w:pPr>
+        <w:spacing w:after="20"/>
+      </w:pPr>
+      <w:r>
+        <w:t>B) Farz</w:t>
+      </w:r>
+    </w:p>
+    <w:p>
+      <w:pPr>
+        <w:spacing w:after="20"/>
+      </w:pPr>
+      <w:r>
+        <w:t>C) Mekruh</w:t>
+      </w:r>
+    </w:p>
+    <w:p>
+      <w:pPr>
+        <w:spacing w:after="160"/>
+      </w:pPr>
+      <w:r>
+        <w:t>D) Mubah</w:t>
       </w:r>
     </w:p>
     <w:p>
       <w:r>
-        <w:t>Amar kaže: „Vitr nije farz, pa nije nikakva obaveza.” U udžbeniku nalazi naziv vadžib.</w:t>
+        <w:rPr>
+          <w:b/>
+        </w:rPr>
+        <w:t>5. Osoba namjerno započne običan razgovor u namazu. Šta taj govor kvari?</w:t>
+      </w:r>
+    </w:p>
+    <w:p>
+      <w:pPr>
+        <w:spacing w:after="20"/>
+      </w:pPr>
+      <w:r>
+        <w:t>A) Namaz, ali sam po sebi ne abdest</w:t>
+      </w:r>
+    </w:p>
+    <w:p>
+      <w:pPr>
+        <w:spacing w:after="20"/>
+      </w:pPr>
+      <w:r>
+        <w:t>B) Samo abdest</w:t>
+      </w:r>
+    </w:p>
+    <w:p>
+      <w:pPr>
+        <w:spacing w:after="20"/>
+      </w:pPr>
+      <w:r>
+        <w:t>C) I namaz i abdest u svakom slučaju</w:t>
+      </w:r>
+    </w:p>
+    <w:p>
+      <w:pPr>
+        <w:spacing w:after="160"/>
+      </w:pPr>
+      <w:r>
+        <w:t>D) Ni namaz ni abdest</w:t>
       </w:r>
     </w:p>
     <w:p>
       <w:r>
-        <w:t>Objasnite razliku između obaveze i preporuke. Koji pojam rješava nedoumicu?</w:t>
-      </w:r>
-    </w:p>
-    <w:p>
-      <w:r>
-        <w:t>Zaključak i razlog: ______________________________________</w:t>
-        <w:br/>
-        <w:t>________________________________________________________</w:t>
+        <w:rPr>
+          <w:b/>
+        </w:rPr>
+        <w:t>6. Koji je najbolji zaključak o vrednovanju postupaka?</w:t>
       </w:r>
     </w:p>
     <w:p>
       <w:pPr>
-        <w:pStyle w:val="Heading2"/>
+        <w:spacing w:after="20"/>
       </w:pPr>
       <w:r>
-        <w:t>Slučaj C</w:t>
-      </w:r>
-    </w:p>
-    <w:p>
-      <w:r>
-        <w:t>Tokom namaza učenik namjerno započne običan razgovor. Drug mu kaže da mora obnoviti i namaz i abdest.</w:t>
-      </w:r>
-    </w:p>
-    <w:p>
-      <w:r>
-        <w:t>Koji se ibadet kvari samim govorom? Koji dodatni podatak bi bio važan za abdest?</w:t>
-      </w:r>
-    </w:p>
-    <w:p>
-      <w:r>
-        <w:t>Zaključak i razlog: ______________________________________</w:t>
-        <w:br/>
-        <w:t>________________________________________________________</w:t>
+        <w:t>A) Sve što nije farz jeste haram</w:t>
       </w:r>
     </w:p>
     <w:p>
       <w:pPr>
-        <w:pStyle w:val="Heading2"/>
+        <w:spacing w:after="20"/>
       </w:pPr>
       <w:r>
-        <w:t>Slučaj D</w:t>
-      </w:r>
-    </w:p>
-    <w:p>
-      <w:r>
-        <w:t>U grupi za dopisivanje neko tvrdi: „Ako mnogo ljudi radi neku stvar, ona je sigurno dozvoljena.” Kao primjer navodi krađu u igri koju prenosi u stvarni život.</w:t>
-      </w:r>
-    </w:p>
-    <w:p>
-      <w:r>
-        <w:t>Da li broj ljudi određuje propis? Razlikujte izmišljenu igru od stvarnog uzimanja tuđe stvari.</w:t>
-      </w:r>
-    </w:p>
-    <w:p>
-      <w:r>
-        <w:t>Zaključak i razlog: ______________________________________</w:t>
-        <w:br/>
-        <w:t>________________________________________________________</w:t>
-      </w:r>
-    </w:p>
-    <w:p>
-      <w:r>
-        <w:br w:type="page"/>
+        <w:t>B) Popularnost određuje šta je dozvoljeno</w:t>
       </w:r>
     </w:p>
     <w:p>
       <w:pPr>
-        <w:pStyle w:val="Heading1"/>
+        <w:spacing w:after="20"/>
       </w:pPr>
       <w:r>
-        <w:t>Kratki kviz</w:t>
-      </w:r>
-    </w:p>
-    <w:p>
-      <w:r>
-        <w:t>Ime ili oznaka __________________  Odaberi jedan odgovor po pitanju.</w:t>
+        <w:t>C) Kategoriju povezujemo s propisom i jasnim okolnostima</w:t>
       </w:r>
     </w:p>
     <w:p>
       <w:pPr>
-        <w:pStyle w:val="Heading2"/>
+        <w:spacing w:after="160"/>
       </w:pPr>
       <w:r>
-        <w:t>1. Kako se zove disciplina koja proučava propise o ljudskim djelima?</w:t>
-      </w:r>
-    </w:p>
-    <w:p>
-      <w:r>
-        <w:t>A) Fikh</w:t>
-        <w:br/>
-        <w:t>B) Geografija</w:t>
-        <w:br/>
-        <w:t>C) Historija</w:t>
-        <w:br/>
-        <w:t>D) Kaligrafija</w:t>
-      </w:r>
-    </w:p>
-    <w:p>
-      <w:pPr>
-        <w:pStyle w:val="Heading2"/>
-      </w:pPr>
-      <w:r>
-        <w:t>2. Koji par ispravno povezuje djelo i kategoriju?</w:t>
-      </w:r>
-    </w:p>
-    <w:p>
-      <w:r>
-        <w:t>A) Vitr-namaz — mubah</w:t>
-        <w:br/>
-        <w:t>B) Ramazanski post — farz</w:t>
-        <w:br/>
-        <w:t>C) Krađa — mekruh</w:t>
-        <w:br/>
-        <w:t>D) Šetnja — vadžib</w:t>
-      </w:r>
-    </w:p>
-    <w:p>
-      <w:pPr>
-        <w:pStyle w:val="Heading2"/>
-      </w:pPr>
-      <w:r>
-        <w:t>3. Kako se u lekciji razvrstava vitr-namaz?</w:t>
-      </w:r>
-    </w:p>
-    <w:p>
-      <w:r>
-        <w:t>A) Sunnet</w:t>
-        <w:br/>
-        <w:t>B) Mubah</w:t>
-        <w:br/>
-        <w:t>C) Vadžib</w:t>
-        <w:br/>
-        <w:t>D) Mufsid</w:t>
-      </w:r>
-    </w:p>
-    <w:p>
-      <w:pPr>
-        <w:pStyle w:val="Heading2"/>
-      </w:pPr>
-      <w:r>
-        <w:t>4. Učenica je završila obaveze i bira hoće li prošetati. Šetnja je u ovom primjeru…</w:t>
-      </w:r>
-    </w:p>
-    <w:p>
-      <w:r>
-        <w:t>A) Haram</w:t>
-        <w:br/>
-        <w:t>B) Farz</w:t>
-        <w:br/>
-        <w:t>C) Mekruh</w:t>
-        <w:br/>
-        <w:t>D) Mubah</w:t>
-      </w:r>
-    </w:p>
-    <w:p>
-      <w:pPr>
-        <w:pStyle w:val="Heading2"/>
-      </w:pPr>
-      <w:r>
-        <w:t>5. Osoba namjerno započne običan razgovor u namazu. Šta taj govor kvari?</w:t>
-      </w:r>
-    </w:p>
-    <w:p>
-      <w:r>
-        <w:t>A) Namaz, ali sam po sebi ne abdest</w:t>
-        <w:br/>
-        <w:t>B) Samo abdest</w:t>
-        <w:br/>
-        <w:t>C) I namaz i abdest u svakom slučaju</w:t>
-        <w:br/>
-        <w:t>D) Ni namaz ni abdest</w:t>
-      </w:r>
-    </w:p>
-    <w:p>
-      <w:pPr>
-        <w:pStyle w:val="Heading2"/>
-      </w:pPr>
-      <w:r>
-        <w:t>6. Koji je najbolji zaključak o vrednovanju postupaka?</w:t>
-      </w:r>
-    </w:p>
-    <w:p>
-      <w:r>
-        <w:t>A) Sve što nije farz jeste haram</w:t>
-        <w:br/>
-        <w:t>B) Popularnost određuje šta je dozvoljeno</w:t>
-        <w:br/>
-        <w:t>C) Kategoriju povezujemo s propisom i jasnim okolnostima</w:t>
-        <w:br/>
         <w:t>D) Sve dozvoljeno moramo uraditi</w:t>
       </w:r>
     </w:p>
@@ -1137,226 +535,255 @@
     </w:p>
     <w:p>
       <w:pPr>
-        <w:pStyle w:val="Heading1"/>
+        <w:pStyle w:val="Title"/>
       </w:pPr>
       <w:r>
-        <w:t>Izlazna kartica</w:t>
+        <w:t>Kviz | pitanja 7–12 od 12</w:t>
       </w:r>
     </w:p>
     <w:p>
       <w:r>
-        <w:t>Ime ili oznaka _______________________  Datum __________</w:t>
+        <w:t>Ime: ____________________    Zaokruži jedan odgovor na svako pitanje.</w:t>
       </w:r>
     </w:p>
     <w:p>
       <w:r>
-        <w:t>1. Razvrstaj svaki postupak. Napiši naziv kategorije.</w:t>
+        <w:rPr>
+          <w:b/>
+        </w:rPr>
+        <w:t>7. Koji opis pripada mustehabu?</w:t>
       </w:r>
     </w:p>
-    <w:tbl>
-      <w:tblPr>
-        <w:tblStyle w:val="TableGrid"/>
-        <w:tblW w:type="auto" w:w="0"/>
-        <w:tblLook w:firstColumn="1" w:firstRow="1" w:lastColumn="0" w:lastRow="0" w:noHBand="0" w:noVBand="1" w:val="04A0"/>
-      </w:tblPr>
-      <w:tblGrid>
-        <w:gridCol w:w="4986"/>
-        <w:gridCol w:w="4986"/>
-      </w:tblGrid>
-      <w:tr>
-        <w:tc>
-          <w:tcPr>
-            <w:tcW w:type="dxa" w:w="4986"/>
-          </w:tcPr>
-          <w:p>
-            <w:r>
-              <w:rPr>
-                <w:sz w:val="20"/>
-              </w:rPr>
-              <w:t>Postupak</w:t>
-            </w:r>
-          </w:p>
-        </w:tc>
-        <w:tc>
-          <w:tcPr>
-            <w:tcW w:type="dxa" w:w="4986"/>
-          </w:tcPr>
-          <w:p>
-            <w:r>
-              <w:rPr>
-                <w:sz w:val="20"/>
-              </w:rPr>
-              <w:t>Kategorija</w:t>
-            </w:r>
-          </w:p>
-        </w:tc>
-      </w:tr>
-      <w:tr>
-        <w:tc>
-          <w:tcPr>
-            <w:tcW w:type="dxa" w:w="4986"/>
-          </w:tcPr>
-          <w:p>
-            <w:r>
-              <w:rPr>
-                <w:sz w:val="20"/>
-              </w:rPr>
-              <w:t>Ramazanski post osobe koja je obavezna postiti.</w:t>
-            </w:r>
-          </w:p>
-        </w:tc>
-        <w:tc>
-          <w:tcPr>
-            <w:tcW w:type="dxa" w:w="4986"/>
-          </w:tcPr>
-          <w:p>
-            <w:r>
-              <w:rPr>
-                <w:sz w:val="20"/>
-              </w:rPr>
-              <w:t>____________</w:t>
-            </w:r>
-          </w:p>
-        </w:tc>
-      </w:tr>
-      <w:tr>
-        <w:tc>
-          <w:tcPr>
-            <w:tcW w:type="dxa" w:w="4986"/>
-          </w:tcPr>
-          <w:p>
-            <w:r>
-              <w:rPr>
-                <w:sz w:val="20"/>
-              </w:rPr>
-              <w:t>Klanjanje vitr-namaza.</w:t>
-            </w:r>
-          </w:p>
-        </w:tc>
-        <w:tc>
-          <w:tcPr>
-            <w:tcW w:type="dxa" w:w="4986"/>
-          </w:tcPr>
-          <w:p>
-            <w:r>
-              <w:rPr>
-                <w:sz w:val="20"/>
-              </w:rPr>
-              <w:t>____________</w:t>
-            </w:r>
-          </w:p>
-        </w:tc>
-      </w:tr>
-      <w:tr>
-        <w:tc>
-          <w:tcPr>
-            <w:tcW w:type="dxa" w:w="4986"/>
-          </w:tcPr>
-          <w:p>
-            <w:r>
-              <w:rPr>
-                <w:sz w:val="20"/>
-              </w:rPr>
-              <w:t>Šetnja u slobodno vrijeme nakon obaveza.</w:t>
-            </w:r>
-          </w:p>
-        </w:tc>
-        <w:tc>
-          <w:tcPr>
-            <w:tcW w:type="dxa" w:w="4986"/>
-          </w:tcPr>
-          <w:p>
-            <w:r>
-              <w:rPr>
-                <w:sz w:val="20"/>
-              </w:rPr>
-              <w:t>____________</w:t>
-            </w:r>
-          </w:p>
-        </w:tc>
-      </w:tr>
-      <w:tr>
-        <w:tc>
-          <w:tcPr>
-            <w:tcW w:type="dxa" w:w="4986"/>
-          </w:tcPr>
-          <w:p>
-            <w:r>
-              <w:rPr>
-                <w:sz w:val="20"/>
-              </w:rPr>
-              <w:t>Krađa tuđe stvari.</w:t>
-            </w:r>
-          </w:p>
-        </w:tc>
-        <w:tc>
-          <w:tcPr>
-            <w:tcW w:type="dxa" w:w="4986"/>
-          </w:tcPr>
-          <w:p>
-            <w:r>
-              <w:rPr>
-                <w:sz w:val="20"/>
-              </w:rPr>
-              <w:t>____________</w:t>
-            </w:r>
-          </w:p>
-        </w:tc>
-      </w:tr>
-      <w:tr>
-        <w:tc>
-          <w:tcPr>
-            <w:tcW w:type="dxa" w:w="4986"/>
-          </w:tcPr>
-          <w:p>
-            <w:r>
-              <w:rPr>
-                <w:sz w:val="20"/>
-              </w:rPr>
-              <w:t>Namjeran obični razgovor u namazu.</w:t>
-            </w:r>
-          </w:p>
-        </w:tc>
-        <w:tc>
-          <w:tcPr>
-            <w:tcW w:type="dxa" w:w="4986"/>
-          </w:tcPr>
-          <w:p>
-            <w:r>
-              <w:rPr>
-                <w:sz w:val="20"/>
-              </w:rPr>
-              <w:t>____________</w:t>
-            </w:r>
-          </w:p>
-        </w:tc>
-      </w:tr>
-    </w:tbl>
     <w:p>
+      <w:pPr>
+        <w:spacing w:after="20"/>
+      </w:pPr>
       <w:r>
-        <w:t>2. Šta se kvari namjernim običnim razgovorom u namazu? Da li sam govor kvari abdest?</w:t>
-        <w:br/>
-        <w:t>________________________________________________________</w:t>
-        <w:br/>
-        <w:t>________________________________________________________</w:t>
+        <w:t>A) Stroga zabrana</w:t>
+      </w:r>
+    </w:p>
+    <w:p>
+      <w:pPr>
+        <w:spacing w:after="20"/>
+      </w:pPr>
+      <w:r>
+        <w:t>B) Preporučeno djelo čije se izostavljanje ne kažnjava</w:t>
+      </w:r>
+    </w:p>
+    <w:p>
+      <w:pPr>
+        <w:spacing w:after="20"/>
+      </w:pPr>
+      <w:r>
+        <w:t>C) Svaka radnja koja kvari obred</w:t>
+      </w:r>
+    </w:p>
+    <w:p>
+      <w:pPr>
+        <w:spacing w:after="160"/>
+      </w:pPr>
+      <w:r>
+        <w:t>D) Obaveza jednaka farzu</w:t>
       </w:r>
     </w:p>
     <w:p>
       <w:r>
-        <w:t>3. Navedi svoj primjer mubaha i objasni zašto je riječ o dozvoljenom izboru. Navedi važne okolnosti.</w:t>
-        <w:br/>
-        <w:t>________________________________________________________</w:t>
-        <w:br/>
-        <w:t>________________________________________________________</w:t>
-        <w:br/>
-        <w:t>________________________________________________________</w:t>
+        <w:rPr>
+          <w:b/>
+        </w:rPr>
+        <w:t>8. Sunneti dnevnih namaza u ovoj su podjeli primjer…</w:t>
+      </w:r>
+    </w:p>
+    <w:p>
+      <w:pPr>
+        <w:spacing w:after="20"/>
+      </w:pPr>
+      <w:r>
+        <w:t>A) Harama</w:t>
+      </w:r>
+    </w:p>
+    <w:p>
+      <w:pPr>
+        <w:spacing w:after="20"/>
+      </w:pPr>
+      <w:r>
+        <w:t>B) Mufsida</w:t>
+      </w:r>
+    </w:p>
+    <w:p>
+      <w:pPr>
+        <w:spacing w:after="20"/>
+      </w:pPr>
+      <w:r>
+        <w:t>C) Mubaha</w:t>
+      </w:r>
+    </w:p>
+    <w:p>
+      <w:pPr>
+        <w:spacing w:after="160"/>
+      </w:pPr>
+      <w:r>
+        <w:t>D) Sunneta</w:t>
       </w:r>
     </w:p>
     <w:p>
       <w:r>
-        <w:t>Moja samoprocjena: □ mogu objasniti  □ treba mi još jedan primjer</w:t>
-        <w:br/>
-        <w:t>Pojam koji želim ponoviti: ________________________________</w:t>
+        <w:rPr>
+          <w:b/>
+        </w:rPr>
+        <w:t>9. Krađa tuđe stvari pripada kategoriji…</w:t>
+      </w:r>
+    </w:p>
+    <w:p>
+      <w:pPr>
+        <w:spacing w:after="20"/>
+      </w:pPr>
+      <w:r>
+        <w:t>A) Mubah</w:t>
+      </w:r>
+    </w:p>
+    <w:p>
+      <w:pPr>
+        <w:spacing w:after="20"/>
+      </w:pPr>
+      <w:r>
+        <w:t>B) Haram</w:t>
+      </w:r>
+    </w:p>
+    <w:p>
+      <w:pPr>
+        <w:spacing w:after="20"/>
+      </w:pPr>
+      <w:r>
+        <w:t>C) Mustehab</w:t>
+      </w:r>
+    </w:p>
+    <w:p>
+      <w:pPr>
+        <w:spacing w:after="160"/>
+      </w:pPr>
+      <w:r>
+        <w:t>D) Vadžib</w:t>
+      </w:r>
+    </w:p>
+    <w:p>
+      <w:r>
+        <w:rPr>
+          <w:b/>
+        </w:rPr>
+        <w:t>10. Šta znači mekruh?</w:t>
+      </w:r>
+    </w:p>
+    <w:p>
+      <w:pPr>
+        <w:spacing w:after="20"/>
+      </w:pPr>
+      <w:r>
+        <w:t>A) Pokuđeno djelo</w:t>
+      </w:r>
+    </w:p>
+    <w:p>
+      <w:pPr>
+        <w:spacing w:after="20"/>
+      </w:pPr>
+      <w:r>
+        <w:t>B) Stroga dužnost</w:t>
+      </w:r>
+    </w:p>
+    <w:p>
+      <w:pPr>
+        <w:spacing w:after="20"/>
+      </w:pPr>
+      <w:r>
+        <w:t>C) Dozvoljen izbor</w:t>
+      </w:r>
+    </w:p>
+    <w:p>
+      <w:pPr>
+        <w:spacing w:after="160"/>
+      </w:pPr>
+      <w:r>
+        <w:t>D) Izvor šerijata</w:t>
+      </w:r>
+    </w:p>
+    <w:p>
+      <w:r>
+        <w:rPr>
+          <w:b/>
+        </w:rPr>
+        <w:t>11. Koja tvrdnja o vadžibu je tačna?</w:t>
+      </w:r>
+    </w:p>
+    <w:p>
+      <w:pPr>
+        <w:spacing w:after="20"/>
+      </w:pPr>
+      <w:r>
+        <w:t>A) To je slobodan izbor</w:t>
+      </w:r>
+    </w:p>
+    <w:p>
+      <w:pPr>
+        <w:spacing w:after="20"/>
+      </w:pPr>
+      <w:r>
+        <w:t>B) To je svaki običaj</w:t>
+      </w:r>
+    </w:p>
+    <w:p>
+      <w:pPr>
+        <w:spacing w:after="20"/>
+      </w:pPr>
+      <w:r>
+        <w:t>C) To je obaveza, a ne samo preporuka</w:t>
+      </w:r>
+    </w:p>
+    <w:p>
+      <w:pPr>
+        <w:spacing w:after="160"/>
+      </w:pPr>
+      <w:r>
+        <w:t>D) To je isto što i haram</w:t>
+      </w:r>
+    </w:p>
+    <w:p>
+      <w:r>
+        <w:rPr>
+          <w:b/>
+        </w:rPr>
+        <w:t>12. Koji primjer pokazuje fardi kifaje?</w:t>
+      </w:r>
+    </w:p>
+    <w:p>
+      <w:pPr>
+        <w:spacing w:after="20"/>
+      </w:pPr>
+      <w:r>
+        <w:t>A) Svaki pojedinac bira boju odjeće</w:t>
+      </w:r>
+    </w:p>
+    <w:p>
+      <w:pPr>
+        <w:spacing w:after="20"/>
+      </w:pPr>
+      <w:r>
+        <w:t>B) Svaki učenik bira izlet</w:t>
+      </w:r>
+    </w:p>
+    <w:p>
+      <w:pPr>
+        <w:spacing w:after="20"/>
+      </w:pPr>
+      <w:r>
+        <w:t>C) Svaki pojedinac obavlja svoj dnevni namaz</w:t>
+      </w:r>
+    </w:p>
+    <w:p>
+      <w:pPr>
+        <w:spacing w:after="160"/>
+      </w:pPr>
+      <w:r>
+        <w:t>D) Dovoljan broj muslimana obavi dženaza-namaz</w:t>
       </w:r>
     </w:p>
     <w:p>
@@ -1366,84 +793,43 @@
     </w:p>
     <w:p>
       <w:pPr>
-        <w:pStyle w:val="Heading1"/>
+        <w:pStyle w:val="Title"/>
       </w:pPr>
       <w:r>
-        <w:t>Dodatno vježbanje</w:t>
+        <w:t>Završna provjera</w:t>
       </w:r>
     </w:p>
     <w:p>
       <w:r>
-        <w:t>Ovaj list koristi se nakon časa ili ako ostane vremena.</w:t>
+        <w:t>1. Navedi primjer mubaha i obrazloži zašto je u tim okolnostima dozvoljen izbor.</w:t>
+        <w:br/>
+        <w:t>________________________________________________________</w:t>
+        <w:br/>
+        <w:t>________________________________________________________</w:t>
       </w:r>
     </w:p>
     <w:p>
       <w:r>
-        <w:t>7. Koji opis pripada mustehabu?</w:t>
+        <w:t>2. Objasni jedan novi termin sa strane 32.</w:t>
         <w:br/>
-        <w:t>A) Stroga zabrana   B) Preporučeno djelo čije se izostavljanje ne kažnjava   C) Svaka radnja koja kvari obred   D) Obaveza jednaka farzu</w:t>
+        <w:t>________________________________________________________</w:t>
+        <w:br/>
+        <w:t>________________________________________________________</w:t>
       </w:r>
     </w:p>
     <w:p>
       <w:r>
-        <w:t>8. Sunneti dnevnih namaza u ovoj su podjeli primjer…</w:t>
-        <w:br/>
-        <w:t>A) Harama   B) Mufsida   C) Mubaha   D) Sunneta</w:t>
+        <w:t>Za zadaću: izradi mapu pojmova ili objasni poruku hadisa o ustrajnosti: „Allahu je najdraže djelo koje je trajno pa makar bilo i malo.”</w:t>
       </w:r>
     </w:p>
     <w:p>
       <w:r>
-        <w:t>9. Krađa tuđe stvari pripada kategoriji…</w:t>
-        <w:br/>
-        <w:t>A) Mubah   B) Haram   C) Mustehab   D) Vadžib</w:t>
-      </w:r>
-    </w:p>
-    <w:p>
-      <w:r>
-        <w:t>10. Šta znači mekruh?</w:t>
-        <w:br/>
-        <w:t>A) Pokuđeno djelo   B) Stroga dužnost   C) Dozvoljen izbor   D) Izvor šerijata</w:t>
-      </w:r>
-    </w:p>
-    <w:p>
-      <w:r>
-        <w:t>11. Koja tvrdnja o vadžibu je tačna?</w:t>
-        <w:br/>
-        <w:t>A) To je slobodan izbor   B) To je svaki običaj   C) To je obaveza, a ne samo preporuka   D) To je isto što i haram</w:t>
-      </w:r>
-    </w:p>
-    <w:p>
-      <w:r>
-        <w:t>12. Koji primjer pokazuje fardi kifaje?</w:t>
-        <w:br/>
-        <w:t>A) Svaki pojedinac bira boju odjeće   B) Svaki učenik bira izlet   C) Svaki pojedinac obavlja svoj dnevni namaz   D) Dovoljan broj muslimana obavi dženaza-namaz</w:t>
-      </w:r>
-    </w:p>
-    <w:p>
-      <w:r>
-        <w:t>Dopuni pojmovima: fikh, farz, mubah, haram, mufsid.</w:t>
-        <w:br/>
-        <w:t>____________ proučava propise o ljudskim djelima.</w:t>
-        <w:br/>
-        <w:t>____________ je stroga dužnost.</w:t>
-        <w:br/>
-        <w:t>____________ je dozvoljen izbor.</w:t>
-        <w:br/>
-        <w:t>____________ je stroga zabrana.</w:t>
-        <w:br/>
-        <w:t>____________ kvari određeni ibadet.</w:t>
-      </w:r>
-    </w:p>
-    <w:p>
-      <w:r>
-        <w:t>Složi poruku iz udžbenika, str. 32: Allahu / je / najdraže / djelo / koje / je / trajno / pa / makar / bilo / i / malo. Zatim svojim riječima objasni poruku.</w:t>
-        <w:br/>
-        <w:t>________________________________________________________</w:t>
+        <w:t>Tabela sa strane 31 dostupna je kao zaseban listić u vodoravnom formatu. Popuni svih 14 redova tokom zajedničke provjere.</w:t>
       </w:r>
     </w:p>
     <w:sectPr>
-      <w:pgSz w:w="12240" w:h="15840"/>
-      <w:pgMar w:top="964" w:right="1134" w:bottom="964" w:left="1134" w:header="720" w:footer="720" w:gutter="0"/>
+      <w:pgSz w:w="11906" w:h="16838"/>
+      <w:pgMar w:top="850" w:right="907" w:bottom="850" w:left="907" w:header="720" w:footer="720" w:gutter="0"/>
       <w:cols w:space="720"/>
       <w:docGrid w:linePitch="360"/>
     </w:sectPr>
@@ -1815,11 +1201,12 @@
     <w:qFormat/>
     <w:rsid w:val="00FC693F"/>
     <w:pPr>
-      <w:spacing w:after="120"/>
+      <w:spacing w:after="100"/>
     </w:pPr>
     <w:rPr>
-      <w:rFonts w:ascii="Calibri" w:hAnsi="Calibri"/>
-      <w:sz w:val="22"/>
+      <w:rFonts w:ascii="Arial" w:hAnsi="Arial"/>
+      <w:color w:val="172E27"/>
+      <w:sz w:val="21"/>
     </w:rPr>
   </w:style>
   <w:style w:type="paragraph" w:styleId="Header">
@@ -1836,6 +1223,10 @@
       </w:tabs>
       <w:spacing w:after="0" w:line="240" w:lineRule="auto"/>
     </w:pPr>
+    <w:rPr>
+      <w:rFonts w:ascii="Arial" w:hAnsi="Arial"/>
+      <w:color w:val="172E27"/>
+    </w:rPr>
   </w:style>
   <w:style w:type="character" w:customStyle="1" w:styleId="HeaderChar">
     <w:name w:val="Header Char"/>
@@ -1858,6 +1249,10 @@
       </w:tabs>
       <w:spacing w:after="0" w:line="240" w:lineRule="auto"/>
     </w:pPr>
+    <w:rPr>
+      <w:rFonts w:ascii="Arial" w:hAnsi="Arial"/>
+      <w:color w:val="172E27"/>
+    </w:rPr>
   </w:style>
   <w:style w:type="character" w:customStyle="1" w:styleId="FooterChar">
     <w:name w:val="Footer Char"/>
@@ -1881,11 +1276,11 @@
       <w:outlineLvl w:val="0"/>
     </w:pPr>
     <w:rPr>
-      <w:rFonts w:asciiTheme="majorHAnsi" w:eastAsiaTheme="majorEastAsia" w:hAnsiTheme="majorHAnsi" w:cstheme="majorBidi" w:ascii="Calibri" w:hAnsi="Calibri"/>
+      <w:rFonts w:asciiTheme="majorHAnsi" w:eastAsiaTheme="majorEastAsia" w:hAnsiTheme="majorHAnsi" w:cstheme="majorBidi" w:ascii="Arial" w:hAnsi="Arial"/>
       <w:b/>
       <w:bCs/>
-      <w:color w:val="000000"/>
-      <w:sz w:val="34"/>
+      <w:color w:val="172E27"/>
+      <w:sz w:val="28"/>
       <w:szCs w:val="28"/>
     </w:rPr>
   </w:style>
@@ -1905,10 +1300,10 @@
       <w:outlineLvl w:val="1"/>
     </w:pPr>
     <w:rPr>
-      <w:rFonts w:asciiTheme="majorHAnsi" w:eastAsiaTheme="majorEastAsia" w:hAnsiTheme="majorHAnsi" w:cstheme="majorBidi" w:ascii="Calibri" w:hAnsi="Calibri"/>
+      <w:rFonts w:asciiTheme="majorHAnsi" w:eastAsiaTheme="majorEastAsia" w:hAnsiTheme="majorHAnsi" w:cstheme="majorBidi" w:ascii="Arial" w:hAnsi="Arial"/>
       <w:b/>
       <w:bCs/>
-      <w:color w:val="000000"/>
+      <w:color w:val="172E27"/>
       <w:sz w:val="26"/>
       <w:szCs w:val="26"/>
     </w:rPr>
@@ -1929,10 +1324,10 @@
       <w:outlineLvl w:val="2"/>
     </w:pPr>
     <w:rPr>
-      <w:rFonts w:asciiTheme="majorHAnsi" w:eastAsiaTheme="majorEastAsia" w:hAnsiTheme="majorHAnsi" w:cstheme="majorBidi"/>
+      <w:rFonts w:asciiTheme="majorHAnsi" w:eastAsiaTheme="majorEastAsia" w:hAnsiTheme="majorHAnsi" w:cstheme="majorBidi" w:ascii="Arial" w:hAnsi="Arial"/>
       <w:b/>
       <w:bCs/>
-      <w:color w:val="4F81BD" w:themeColor="accent1"/>
+      <w:color w:val="172E27"/>
     </w:rPr>
   </w:style>
   <w:style w:type="paragraph" w:styleId="Heading4">
@@ -1952,12 +1347,12 @@
       <w:outlineLvl w:val="3"/>
     </w:pPr>
     <w:rPr>
-      <w:rFonts w:asciiTheme="majorHAnsi" w:eastAsiaTheme="majorEastAsia" w:hAnsiTheme="majorHAnsi" w:cstheme="majorBidi"/>
+      <w:rFonts w:asciiTheme="majorHAnsi" w:eastAsiaTheme="majorEastAsia" w:hAnsiTheme="majorHAnsi" w:cstheme="majorBidi" w:ascii="Arial" w:hAnsi="Arial"/>
       <w:b/>
       <w:bCs/>
       <w:i/>
       <w:iCs/>
-      <w:color w:val="4F81BD" w:themeColor="accent1"/>
+      <w:color w:val="172E27"/>
     </w:rPr>
   </w:style>
   <w:style w:type="paragraph" w:styleId="Heading5">
@@ -1977,8 +1372,8 @@
       <w:outlineLvl w:val="4"/>
     </w:pPr>
     <w:rPr>
-      <w:rFonts w:asciiTheme="majorHAnsi" w:eastAsiaTheme="majorEastAsia" w:hAnsiTheme="majorHAnsi" w:cstheme="majorBidi"/>
-      <w:color w:val="243F60" w:themeColor="accent1" w:themeShade="7F"/>
+      <w:rFonts w:asciiTheme="majorHAnsi" w:eastAsiaTheme="majorEastAsia" w:hAnsiTheme="majorHAnsi" w:cstheme="majorBidi" w:ascii="Arial" w:hAnsi="Arial"/>
+      <w:color w:val="172E27"/>
     </w:rPr>
   </w:style>
   <w:style w:type="paragraph" w:styleId="Heading6">
@@ -1998,10 +1393,10 @@
       <w:outlineLvl w:val="5"/>
     </w:pPr>
     <w:rPr>
-      <w:rFonts w:asciiTheme="majorHAnsi" w:eastAsiaTheme="majorEastAsia" w:hAnsiTheme="majorHAnsi" w:cstheme="majorBidi"/>
+      <w:rFonts w:asciiTheme="majorHAnsi" w:eastAsiaTheme="majorEastAsia" w:hAnsiTheme="majorHAnsi" w:cstheme="majorBidi" w:ascii="Arial" w:hAnsi="Arial"/>
       <w:i/>
       <w:iCs/>
-      <w:color w:val="243F60" w:themeColor="accent1" w:themeShade="7F"/>
+      <w:color w:val="172E27"/>
     </w:rPr>
   </w:style>
   <w:style w:type="paragraph" w:styleId="Heading7">
@@ -2021,10 +1416,10 @@
       <w:outlineLvl w:val="6"/>
     </w:pPr>
     <w:rPr>
-      <w:rFonts w:asciiTheme="majorHAnsi" w:eastAsiaTheme="majorEastAsia" w:hAnsiTheme="majorHAnsi" w:cstheme="majorBidi"/>
+      <w:rFonts w:asciiTheme="majorHAnsi" w:eastAsiaTheme="majorEastAsia" w:hAnsiTheme="majorHAnsi" w:cstheme="majorBidi" w:ascii="Arial" w:hAnsi="Arial"/>
       <w:i/>
       <w:iCs/>
-      <w:color w:val="404040" w:themeColor="text1" w:themeTint="BF"/>
+      <w:color w:val="172E27"/>
     </w:rPr>
   </w:style>
   <w:style w:type="paragraph" w:styleId="Heading8">
@@ -2044,8 +1439,8 @@
       <w:outlineLvl w:val="7"/>
     </w:pPr>
     <w:rPr>
-      <w:rFonts w:asciiTheme="majorHAnsi" w:eastAsiaTheme="majorEastAsia" w:hAnsiTheme="majorHAnsi" w:cstheme="majorBidi"/>
-      <w:color w:val="4F81BD" w:themeColor="accent1"/>
+      <w:rFonts w:asciiTheme="majorHAnsi" w:eastAsiaTheme="majorEastAsia" w:hAnsiTheme="majorHAnsi" w:cstheme="majorBidi" w:ascii="Arial" w:hAnsi="Arial"/>
+      <w:color w:val="172E27"/>
       <w:sz w:val="20"/>
       <w:szCs w:val="20"/>
     </w:rPr>
@@ -2067,10 +1462,10 @@
       <w:outlineLvl w:val="8"/>
     </w:pPr>
     <w:rPr>
-      <w:rFonts w:asciiTheme="majorHAnsi" w:eastAsiaTheme="majorEastAsia" w:hAnsiTheme="majorHAnsi" w:cstheme="majorBidi"/>
+      <w:rFonts w:asciiTheme="majorHAnsi" w:eastAsiaTheme="majorEastAsia" w:hAnsiTheme="majorHAnsi" w:cstheme="majorBidi" w:ascii="Arial" w:hAnsi="Arial"/>
       <w:i/>
       <w:iCs/>
-      <w:color w:val="404040" w:themeColor="text1" w:themeTint="BF"/>
+      <w:color w:val="172E27"/>
       <w:sz w:val="20"/>
       <w:szCs w:val="20"/>
     </w:rPr>
@@ -2110,6 +1505,10 @@
     <w:pPr>
       <w:spacing w:after="0" w:line="240" w:lineRule="auto"/>
     </w:pPr>
+    <w:rPr>
+      <w:rFonts w:ascii="Arial" w:hAnsi="Arial"/>
+      <w:color w:val="172E27"/>
+    </w:rPr>
   </w:style>
   <w:style w:type="character" w:customStyle="1" w:styleId="Heading1Char">
     <w:name w:val="Heading 1 Char"/>
@@ -2167,11 +1566,11 @@
       <w:contextualSpacing/>
     </w:pPr>
     <w:rPr>
-      <w:rFonts w:asciiTheme="majorHAnsi" w:eastAsiaTheme="majorEastAsia" w:hAnsiTheme="majorHAnsi" w:cstheme="majorBidi" w:ascii="Calibri" w:hAnsi="Calibri"/>
-      <w:color w:val="000000"/>
+      <w:rFonts w:asciiTheme="majorHAnsi" w:eastAsiaTheme="majorEastAsia" w:hAnsiTheme="majorHAnsi" w:cstheme="majorBidi" w:ascii="Arial" w:hAnsi="Arial"/>
+      <w:color w:val="172E27"/>
       <w:spacing w:val="5"/>
       <w:kern w:val="28"/>
-      <w:sz w:val="46"/>
+      <w:sz w:val="52"/>
       <w:szCs w:val="52"/>
     </w:rPr>
   </w:style>
@@ -2204,10 +1603,10 @@
       </w:numPr>
     </w:pPr>
     <w:rPr>
-      <w:rFonts w:asciiTheme="majorHAnsi" w:eastAsiaTheme="majorEastAsia" w:hAnsiTheme="majorHAnsi" w:cstheme="majorBidi"/>
+      <w:rFonts w:asciiTheme="majorHAnsi" w:eastAsiaTheme="majorEastAsia" w:hAnsiTheme="majorHAnsi" w:cstheme="majorBidi" w:ascii="Arial" w:hAnsi="Arial"/>
       <w:i/>
       <w:iCs/>
-      <w:color w:val="4F81BD" w:themeColor="accent1"/>
+      <w:color w:val="172E27"/>
       <w:spacing w:val="15"/>
       <w:sz w:val="24"/>
       <w:szCs w:val="24"/>
@@ -2239,6 +1638,10 @@
       <w:ind w:left="720"/>
       <w:contextualSpacing/>
     </w:pPr>
+    <w:rPr>
+      <w:rFonts w:ascii="Arial" w:hAnsi="Arial"/>
+      <w:color w:val="172E27"/>
+    </w:rPr>
   </w:style>
   <w:style w:type="paragraph" w:styleId="BodyText">
     <w:name w:val="Body Text"/>
@@ -2250,6 +1653,10 @@
     <w:pPr>
       <w:spacing w:after="120"/>
     </w:pPr>
+    <w:rPr>
+      <w:rFonts w:ascii="Arial" w:hAnsi="Arial"/>
+      <w:color w:val="172E27"/>
+    </w:rPr>
   </w:style>
   <w:style w:type="character" w:customStyle="1" w:styleId="BodyTextChar">
     <w:name w:val="Body Text Char"/>
@@ -2268,6 +1675,10 @@
     <w:pPr>
       <w:spacing w:after="120" w:line="480" w:lineRule="auto"/>
     </w:pPr>
+    <w:rPr>
+      <w:rFonts w:ascii="Arial" w:hAnsi="Arial"/>
+      <w:color w:val="172E27"/>
+    </w:rPr>
   </w:style>
   <w:style w:type="character" w:customStyle="1" w:styleId="BodyText2Char">
     <w:name w:val="Body Text 2 Char"/>
@@ -2287,6 +1698,8 @@
       <w:spacing w:after="120"/>
     </w:pPr>
     <w:rPr>
+      <w:rFonts w:ascii="Arial" w:hAnsi="Arial"/>
+      <w:color w:val="172E27"/>
       <w:sz w:val="16"/>
       <w:szCs w:val="16"/>
     </w:rPr>
@@ -2312,6 +1725,10 @@
       <w:ind w:left="360" w:hanging="360"/>
       <w:contextualSpacing/>
     </w:pPr>
+    <w:rPr>
+      <w:rFonts w:ascii="Arial" w:hAnsi="Arial"/>
+      <w:color w:val="172E27"/>
+    </w:rPr>
   </w:style>
   <w:style w:type="paragraph" w:styleId="List2">
     <w:name w:val="List 2"/>
@@ -2323,6 +1740,10 @@
       <w:ind w:left="720" w:hanging="360"/>
       <w:contextualSpacing/>
     </w:pPr>
+    <w:rPr>
+      <w:rFonts w:ascii="Arial" w:hAnsi="Arial"/>
+      <w:color w:val="172E27"/>
+    </w:rPr>
   </w:style>
   <w:style w:type="paragraph" w:styleId="List3">
     <w:name w:val="List 3"/>
@@ -2334,6 +1755,10 @@
       <w:ind w:left="1080" w:hanging="360"/>
       <w:contextualSpacing/>
     </w:pPr>
+    <w:rPr>
+      <w:rFonts w:ascii="Arial" w:hAnsi="Arial"/>
+      <w:color w:val="172E27"/>
+    </w:rPr>
   </w:style>
   <w:style w:type="paragraph" w:styleId="ListBullet">
     <w:name w:val="List Bullet"/>
@@ -2347,6 +1772,10 @@
       </w:numPr>
       <w:contextualSpacing/>
     </w:pPr>
+    <w:rPr>
+      <w:rFonts w:ascii="Arial" w:hAnsi="Arial"/>
+      <w:color w:val="172E27"/>
+    </w:rPr>
   </w:style>
   <w:style w:type="paragraph" w:styleId="ListBullet2">
     <w:name w:val="List Bullet 2"/>
@@ -2360,6 +1789,10 @@
       </w:numPr>
       <w:contextualSpacing/>
     </w:pPr>
+    <w:rPr>
+      <w:rFonts w:ascii="Arial" w:hAnsi="Arial"/>
+      <w:color w:val="172E27"/>
+    </w:rPr>
   </w:style>
   <w:style w:type="paragraph" w:styleId="ListBullet3">
     <w:name w:val="List Bullet 3"/>
@@ -2373,6 +1806,10 @@
       </w:numPr>
       <w:contextualSpacing/>
     </w:pPr>
+    <w:rPr>
+      <w:rFonts w:ascii="Arial" w:hAnsi="Arial"/>
+      <w:color w:val="172E27"/>
+    </w:rPr>
   </w:style>
   <w:style w:type="paragraph" w:styleId="ListNumber">
     <w:name w:val="List Number"/>
@@ -2386,6 +1823,10 @@
       </w:numPr>
       <w:contextualSpacing/>
     </w:pPr>
+    <w:rPr>
+      <w:rFonts w:ascii="Arial" w:hAnsi="Arial"/>
+      <w:color w:val="172E27"/>
+    </w:rPr>
   </w:style>
   <w:style w:type="paragraph" w:styleId="ListNumber2">
     <w:name w:val="List Number 2"/>
@@ -2399,6 +1840,10 @@
       </w:numPr>
       <w:contextualSpacing/>
     </w:pPr>
+    <w:rPr>
+      <w:rFonts w:ascii="Arial" w:hAnsi="Arial"/>
+      <w:color w:val="172E27"/>
+    </w:rPr>
   </w:style>
   <w:style w:type="paragraph" w:styleId="ListNumber3">
     <w:name w:val="List Number 3"/>
@@ -2412,6 +1857,10 @@
       </w:numPr>
       <w:contextualSpacing/>
     </w:pPr>
+    <w:rPr>
+      <w:rFonts w:ascii="Arial" w:hAnsi="Arial"/>
+      <w:color w:val="172E27"/>
+    </w:rPr>
   </w:style>
   <w:style w:type="paragraph" w:styleId="ListContinue">
     <w:name w:val="List Continue"/>
@@ -2424,6 +1873,10 @@
       <w:ind w:left="360"/>
       <w:contextualSpacing/>
     </w:pPr>
+    <w:rPr>
+      <w:rFonts w:ascii="Arial" w:hAnsi="Arial"/>
+      <w:color w:val="172E27"/>
+    </w:rPr>
   </w:style>
   <w:style w:type="paragraph" w:styleId="ListContinue2">
     <w:name w:val="List Continue 2"/>
@@ -2436,6 +1889,10 @@
       <w:ind w:left="720"/>
       <w:contextualSpacing/>
     </w:pPr>
+    <w:rPr>
+      <w:rFonts w:ascii="Arial" w:hAnsi="Arial"/>
+      <w:color w:val="172E27"/>
+    </w:rPr>
   </w:style>
   <w:style w:type="paragraph" w:styleId="ListContinue3">
     <w:name w:val="List Continue 3"/>
@@ -2448,6 +1905,10 @@
       <w:ind w:left="1080"/>
       <w:contextualSpacing/>
     </w:pPr>
+    <w:rPr>
+      <w:rFonts w:ascii="Arial" w:hAnsi="Arial"/>
+      <w:color w:val="172E27"/>
+    </w:rPr>
   </w:style>
   <w:style w:type="paragraph" w:styleId="MacroText">
     <w:name w:val="macro"/>
@@ -2467,7 +1928,8 @@
       </w:tabs>
     </w:pPr>
     <w:rPr>
-      <w:rFonts w:ascii="Courier" w:hAnsi="Courier"/>
+      <w:rFonts w:ascii="Arial" w:hAnsi="Arial"/>
+      <w:color w:val="172E27"/>
       <w:sz w:val="20"/>
       <w:szCs w:val="20"/>
     </w:rPr>
@@ -2493,9 +1955,10 @@
     <w:qFormat/>
     <w:rsid w:val="00FC693F"/>
     <w:rPr>
+      <w:rFonts w:ascii="Arial" w:hAnsi="Arial"/>
       <w:i/>
       <w:iCs/>
-      <w:color w:val="000000" w:themeColor="text1"/>
+      <w:color w:val="172E27"/>
     </w:rPr>
   </w:style>
   <w:style w:type="character" w:customStyle="1" w:styleId="QuoteChar">
@@ -2609,9 +2072,10 @@
       <w:spacing w:line="240" w:lineRule="auto"/>
     </w:pPr>
     <w:rPr>
+      <w:rFonts w:ascii="Arial" w:hAnsi="Arial"/>
       <w:b/>
       <w:bCs/>
-      <w:color w:val="4F81BD" w:themeColor="accent1"/>
+      <w:color w:val="172E27"/>
       <w:sz w:val="18"/>
       <w:szCs w:val="18"/>
     </w:rPr>
@@ -2651,11 +2115,12 @@
       <w:ind w:left="936" w:right="936"/>
     </w:pPr>
     <w:rPr>
+      <w:rFonts w:ascii="Arial" w:hAnsi="Arial"/>
       <w:b/>
       <w:bCs/>
       <w:i/>
       <w:iCs/>
-      <w:color w:val="4F81BD" w:themeColor="accent1"/>
+      <w:color w:val="172E27"/>
     </w:rPr>
   </w:style>
   <w:style w:type="character" w:customStyle="1" w:styleId="IntenseQuoteChar">
@@ -2750,6 +2215,10 @@
     <w:pPr>
       <w:outlineLvl w:val="9"/>
     </w:pPr>
+    <w:rPr>
+      <w:rFonts w:ascii="Arial" w:hAnsi="Arial"/>
+      <w:color w:val="172E27"/>
+    </w:rPr>
   </w:style>
   <w:style w:type="table" w:styleId="TableGrid">
     <w:name w:val="Table Grid"/>

</xml_diff>

<commit_message>
Dodaj slucaj E i prilagodi materijale za pet grupa
</commit_message>
<xml_diff>
--- a/materijali/Listici za ucenike.docx
+++ b/materijali/Listici za ucenike.docx
@@ -827,6 +827,167 @@
         <w:t>Tabela sa strane 31 dostupna je kao zaseban listić u vodoravnom formatu. Popuni svih 14 redova tokom zajedničke provjere.</w:t>
       </w:r>
     </w:p>
+    <w:p>
+      <w:r>
+        <w:br w:type="page"/>
+      </w:r>
+    </w:p>
+    <w:p>
+      <w:pPr>
+        <w:pStyle w:val="Title"/>
+      </w:pPr>
+      <w:r>
+        <w:t>Slučajevi za grupni rad</w:t>
+      </w:r>
+    </w:p>
+    <w:p>
+      <w:r>
+        <w:t>Pet grupa A–E • 3–4 učenika po grupi. Pročitajte dodijeljeni slučaj i obrazložite zajednički odgovor.</w:t>
+      </w:r>
+    </w:p>
+    <w:p>
+      <w:pPr>
+        <w:pStyle w:val="Heading2"/>
+      </w:pPr>
+      <w:r>
+        <w:t>Grupa A</w:t>
+      </w:r>
+    </w:p>
+    <w:p>
+      <w:r>
+        <w:t>Nakon obaveza Lejla bira hoće li prošetati ili ostati kod kuće. Prijateljica tvrdi: „Ako nije farz, onda je haram.”</w:t>
+      </w:r>
+    </w:p>
+    <w:p>
+      <w:r>
+        <w:t>Procijenite šetnju u navedenim okolnostima. Ispravite tvrdnju i navedite razlog.</w:t>
+      </w:r>
+    </w:p>
+    <w:p>
+      <w:r>
+        <w:t>Odgovor: __________________________________________________</w:t>
+        <w:br/>
+        <w:t>___________________________________________________________</w:t>
+      </w:r>
+    </w:p>
+    <w:p>
+      <w:pPr>
+        <w:pStyle w:val="Heading2"/>
+      </w:pPr>
+      <w:r>
+        <w:t>Grupa B</w:t>
+      </w:r>
+    </w:p>
+    <w:p>
+      <w:r>
+        <w:t>Amar kaže: „Vitr nije farz, pa nije nikakva obaveza.” U udžbeniku nalazi naziv vadžib.</w:t>
+      </w:r>
+    </w:p>
+    <w:p>
+      <w:r>
+        <w:t>Objasnite razliku između obaveze i preporuke. Koji pojam rješava nedoumicu?</w:t>
+      </w:r>
+    </w:p>
+    <w:p>
+      <w:r>
+        <w:t>Odgovor: __________________________________________________</w:t>
+        <w:br/>
+        <w:t>___________________________________________________________</w:t>
+      </w:r>
+    </w:p>
+    <w:p>
+      <w:pPr>
+        <w:pStyle w:val="Heading2"/>
+      </w:pPr>
+      <w:r>
+        <w:t>Grupa C</w:t>
+      </w:r>
+    </w:p>
+    <w:p>
+      <w:r>
+        <w:t>Tokom namaza učenik namjerno započne običan razgovor. Drug mu kaže da mora obnoviti i namaz i abdest.</w:t>
+      </w:r>
+    </w:p>
+    <w:p>
+      <w:r>
+        <w:t>Koji se ibadet kvari samim govorom? Koji dodatni podatak bi bio važan za abdest?</w:t>
+      </w:r>
+    </w:p>
+    <w:p>
+      <w:r>
+        <w:t>Odgovor: __________________________________________________</w:t>
+        <w:br/>
+        <w:t>___________________________________________________________</w:t>
+      </w:r>
+    </w:p>
+    <w:p>
+      <w:r>
+        <w:br w:type="page"/>
+      </w:r>
+    </w:p>
+    <w:p>
+      <w:pPr>
+        <w:pStyle w:val="Title"/>
+      </w:pPr>
+      <w:r>
+        <w:t>Slučajevi za grupni rad</w:t>
+      </w:r>
+    </w:p>
+    <w:p>
+      <w:r>
+        <w:t>Pet grupa A–E • 3–4 učenika po grupi. Pročitajte dodijeljeni slučaj i obrazložite zajednički odgovor.</w:t>
+      </w:r>
+    </w:p>
+    <w:p>
+      <w:pPr>
+        <w:pStyle w:val="Heading2"/>
+      </w:pPr>
+      <w:r>
+        <w:t>Grupa D</w:t>
+      </w:r>
+    </w:p>
+    <w:p>
+      <w:r>
+        <w:t>U grupi za dopisivanje neko tvrdi: „Ako mnogo ljudi radi neku stvar, ona je sigurno dozvoljena.” Kao primjer navodi krađu u igri koju prenosi u stvarni život.</w:t>
+      </w:r>
+    </w:p>
+    <w:p>
+      <w:r>
+        <w:t>Da li broj ljudi određuje propis? Razlikujte izmišljenu igru od stvarnog uzimanja tuđe stvari.</w:t>
+      </w:r>
+    </w:p>
+    <w:p>
+      <w:r>
+        <w:t>Odgovor: __________________________________________________</w:t>
+        <w:br/>
+        <w:t>___________________________________________________________</w:t>
+      </w:r>
+    </w:p>
+    <w:p>
+      <w:pPr>
+        <w:pStyle w:val="Heading2"/>
+      </w:pPr>
+      <w:r>
+        <w:t>Grupa E</w:t>
+      </w:r>
+    </w:p>
+    <w:p>
+      <w:r>
+        <w:t>Sara u udžbeniku čita da su sunneti dnevnih namaza primjer sunneta. Prijatelj kaže: „Ako nešto nije farz, njegovo činjenje nema nikakvu vrijednost.”</w:t>
+      </w:r>
+    </w:p>
+    <w:p>
+      <w:r>
+        <w:t>Procijenite tvrdnju. Objasnite kojoj kategoriji pripadaju sunneti dnevnih namaza i po čemu se razlikuju od farza.</w:t>
+      </w:r>
+    </w:p>
+    <w:p>
+      <w:r>
+        <w:t>Odgovor: __________________________________________________</w:t>
+        <w:br/>
+        <w:t>___________________________________________________________</w:t>
+      </w:r>
+    </w:p>
     <w:sectPr>
       <w:pgSz w:w="11906" w:h="16838"/>
       <w:pgMar w:top="850" w:right="907" w:bottom="850" w:left="907" w:header="720" w:footer="720" w:gutter="0"/>

</xml_diff>